<commit_message>
changed file sound extension from wav to mp3
</commit_message>
<xml_diff>
--- a/Managa_WAS262_SF1.docx
+++ b/Managa_WAS262_SF1.docx
@@ -382,7 +382,7 @@
                 <w:pict>
                   <v:group w14:anchorId="27C9683E" id="Group 252" o:spid="_x0000_s1026" style="position:absolute;margin-left:193.95pt;margin-top:0;width:245.15pt;height:11in;z-index:251659264;mso-width-percent:400;mso-height-percent:1000;mso-position-horizontal:right;mso-position-horizontal-relative:page;mso-position-vertical:top;mso-position-vertical-relative:page;mso-width-percent:400;mso-height-percent:1000" coordsize="31136,100584" o:gfxdata="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">
                     <v:rect id="Rectangle 459" o:spid="_x0000_s1027" alt="Light vertical" style="position:absolute;width:1385;height:100584;visibility:visible;mso-wrap-style:square;v-text-anchor:middle" o:gfxdata="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" fillcolor="#8dd873 [1945]" stroked="f" strokecolor="white" strokeweight="1pt">
-                      <v:fill r:id="rId5" o:title="" opacity="52428f" color2="white [3212]" o:opacity2="52428f" type="pattern"/>
+                      <v:fill r:id="rId7" o:title="" opacity="52428f" color2="white [3212]" o:opacity2="52428f" type="pattern"/>
                       <v:shadow color="#d8d8d8" offset="3pt,3pt"/>
                     </v:rect>
                     <v:rect id="Rectangle 460" o:spid="_x0000_s1028" style="position:absolute;left:1246;width:29718;height:100584;visibility:visible;mso-wrap-style:square;v-text-anchor:top" o:gfxdata="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" fillcolor="#8dd873 [1945]" stroked="f" strokecolor="#d8d8d8"/>
@@ -722,7 +722,7 @@
                         <pic:cNvPicPr/>
                       </pic:nvPicPr>
                       <pic:blipFill>
-                        <a:blip r:embed="rId6">
+                        <a:blip r:embed="rId8">
                           <a:extLst>
                             <a:ext uri="{28A0092B-C50C-407E-A947-70E740481C1C}">
                               <a14:useLocalDpi xmlns:a14="http://schemas.microsoft.com/office/drawing/2010/main" val="0"/>
@@ -763,11 +763,952 @@
         </w:p>
       </w:sdtContent>
     </w:sdt>
+    <w:sdt>
+      <w:sdtPr>
+        <w:rPr>
+          <w:rFonts w:asciiTheme="minorHAnsi" w:eastAsiaTheme="minorHAnsi" w:hAnsiTheme="minorHAnsi" w:cstheme="minorBidi"/>
+          <w:color w:val="auto"/>
+          <w:kern w:val="2"/>
+          <w:sz w:val="24"/>
+          <w:szCs w:val="24"/>
+          <w:lang w:val="en-ZA"/>
+          <w14:ligatures w14:val="standardContextual"/>
+        </w:rPr>
+        <w:id w:val="1531680529"/>
+        <w:docPartObj>
+          <w:docPartGallery w:val="Table of Contents"/>
+          <w:docPartUnique/>
+        </w:docPartObj>
+      </w:sdtPr>
+      <w:sdtEndPr>
+        <w:rPr>
+          <w:b/>
+          <w:bCs/>
+          <w:noProof/>
+        </w:rPr>
+      </w:sdtEndPr>
+      <w:sdtContent>
+        <w:p>
+          <w:pPr>
+            <w:pStyle w:val="TOCHeading"/>
+          </w:pPr>
+          <w:r>
+            <w:t>Table of Contents</w:t>
+          </w:r>
+        </w:p>
+        <w:p>
+          <w:pPr>
+            <w:pStyle w:val="TOC1"/>
+            <w:tabs>
+              <w:tab w:val="right" w:leader="dot" w:pos="9016"/>
+            </w:tabs>
+            <w:rPr>
+              <w:rFonts w:eastAsiaTheme="minorEastAsia"/>
+              <w:noProof/>
+              <w:lang w:eastAsia="en-ZA"/>
+            </w:rPr>
+          </w:pPr>
+          <w:r>
+            <w:fldChar w:fldCharType="begin"/>
+          </w:r>
+          <w:r>
+            <w:instrText xml:space="preserve"> TOC \o "1-3" \h \z \u </w:instrText>
+          </w:r>
+          <w:r>
+            <w:fldChar w:fldCharType="separate"/>
+          </w:r>
+          <w:hyperlink w:anchor="_Toc241515166" w:history="1">
+            <w:r>
+              <w:rPr>
+                <w:rStyle w:val="Hyperlink"/>
+                <w:noProof/>
+              </w:rPr>
+              <w:t>Task 1</w:t>
+            </w:r>
+            <w:r>
+              <w:rPr>
+                <w:noProof/>
+                <w:webHidden/>
+              </w:rPr>
+              <w:tab/>
+            </w:r>
+            <w:r>
+              <w:rPr>
+                <w:noProof/>
+                <w:webHidden/>
+              </w:rPr>
+              <w:fldChar w:fldCharType="begin"/>
+            </w:r>
+            <w:r>
+              <w:rPr>
+                <w:noProof/>
+                <w:webHidden/>
+              </w:rPr>
+              <w:instrText xml:space="preserve"> PAGEREF _Toc241515166 \h </w:instrText>
+            </w:r>
+            <w:r>
+              <w:rPr>
+                <w:noProof/>
+                <w:webHidden/>
+              </w:rPr>
+            </w:r>
+            <w:r>
+              <w:rPr>
+                <w:noProof/>
+                <w:webHidden/>
+              </w:rPr>
+              <w:fldChar w:fldCharType="separate"/>
+            </w:r>
+            <w:r>
+              <w:rPr>
+                <w:noProof/>
+                <w:webHidden/>
+              </w:rPr>
+              <w:t>2</w:t>
+            </w:r>
+            <w:r>
+              <w:rPr>
+                <w:noProof/>
+                <w:webHidden/>
+              </w:rPr>
+              <w:fldChar w:fldCharType="end"/>
+            </w:r>
+          </w:hyperlink>
+        </w:p>
+        <w:p>
+          <w:pPr>
+            <w:pStyle w:val="TOC2"/>
+            <w:tabs>
+              <w:tab w:val="right" w:leader="dot" w:pos="9016"/>
+            </w:tabs>
+            <w:rPr>
+              <w:rFonts w:eastAsiaTheme="minorEastAsia"/>
+              <w:noProof/>
+              <w:lang w:eastAsia="en-ZA"/>
+            </w:rPr>
+          </w:pPr>
+          <w:hyperlink w:anchor="_Toc241515167" w:history="1">
+            <w:r>
+              <w:rPr>
+                <w:rStyle w:val="Hyperlink"/>
+                <w:noProof/>
+              </w:rPr>
+              <w:t>GitHub Repository Setup</w:t>
+            </w:r>
+            <w:r>
+              <w:rPr>
+                <w:noProof/>
+                <w:webHidden/>
+              </w:rPr>
+              <w:tab/>
+            </w:r>
+            <w:r>
+              <w:rPr>
+                <w:noProof/>
+                <w:webHidden/>
+              </w:rPr>
+              <w:fldChar w:fldCharType="begin"/>
+            </w:r>
+            <w:r>
+              <w:rPr>
+                <w:noProof/>
+                <w:webHidden/>
+              </w:rPr>
+              <w:instrText xml:space="preserve"> PAGEREF _Toc241515167 \h </w:instrText>
+            </w:r>
+            <w:r>
+              <w:rPr>
+                <w:noProof/>
+                <w:webHidden/>
+              </w:rPr>
+            </w:r>
+            <w:r>
+              <w:rPr>
+                <w:noProof/>
+                <w:webHidden/>
+              </w:rPr>
+              <w:fldChar w:fldCharType="separate"/>
+            </w:r>
+            <w:r>
+              <w:rPr>
+                <w:noProof/>
+                <w:webHidden/>
+              </w:rPr>
+              <w:t>2</w:t>
+            </w:r>
+            <w:r>
+              <w:rPr>
+                <w:noProof/>
+                <w:webHidden/>
+              </w:rPr>
+              <w:fldChar w:fldCharType="end"/>
+            </w:r>
+          </w:hyperlink>
+        </w:p>
+        <w:p>
+          <w:pPr>
+            <w:pStyle w:val="TOC3"/>
+            <w:tabs>
+              <w:tab w:val="right" w:leader="dot" w:pos="9016"/>
+            </w:tabs>
+            <w:rPr>
+              <w:rFonts w:eastAsiaTheme="minorEastAsia"/>
+              <w:noProof/>
+              <w:lang w:eastAsia="en-ZA"/>
+            </w:rPr>
+          </w:pPr>
+          <w:hyperlink w:anchor="_Toc241515168" w:history="1">
+            <w:r>
+              <w:rPr>
+                <w:rStyle w:val="Hyperlink"/>
+                <w:noProof/>
+              </w:rPr>
+              <w:t>Installation/Setup Instructions</w:t>
+            </w:r>
+            <w:r>
+              <w:rPr>
+                <w:noProof/>
+                <w:webHidden/>
+              </w:rPr>
+              <w:tab/>
+            </w:r>
+            <w:r>
+              <w:rPr>
+                <w:noProof/>
+                <w:webHidden/>
+              </w:rPr>
+              <w:fldChar w:fldCharType="begin"/>
+            </w:r>
+            <w:r>
+              <w:rPr>
+                <w:noProof/>
+                <w:webHidden/>
+              </w:rPr>
+              <w:instrText xml:space="preserve"> PAGEREF _Toc241515168 \h </w:instrText>
+            </w:r>
+            <w:r>
+              <w:rPr>
+                <w:noProof/>
+                <w:webHidden/>
+              </w:rPr>
+            </w:r>
+            <w:r>
+              <w:rPr>
+                <w:noProof/>
+                <w:webHidden/>
+              </w:rPr>
+              <w:fldChar w:fldCharType="separate"/>
+            </w:r>
+            <w:r>
+              <w:rPr>
+                <w:noProof/>
+                <w:webHidden/>
+              </w:rPr>
+              <w:t>2</w:t>
+            </w:r>
+            <w:r>
+              <w:rPr>
+                <w:noProof/>
+                <w:webHidden/>
+              </w:rPr>
+              <w:fldChar w:fldCharType="end"/>
+            </w:r>
+          </w:hyperlink>
+        </w:p>
+        <w:p>
+          <w:pPr>
+            <w:pStyle w:val="TOC3"/>
+            <w:tabs>
+              <w:tab w:val="right" w:leader="dot" w:pos="9016"/>
+            </w:tabs>
+            <w:rPr>
+              <w:rFonts w:eastAsiaTheme="minorEastAsia"/>
+              <w:noProof/>
+              <w:lang w:eastAsia="en-ZA"/>
+            </w:rPr>
+          </w:pPr>
+          <w:hyperlink w:anchor="_Toc241515169" w:history="1">
+            <w:r>
+              <w:rPr>
+                <w:rStyle w:val="Hyperlink"/>
+                <w:noProof/>
+              </w:rPr>
+              <w:t>Initial Folder Structure</w:t>
+            </w:r>
+            <w:r>
+              <w:rPr>
+                <w:noProof/>
+                <w:webHidden/>
+              </w:rPr>
+              <w:tab/>
+            </w:r>
+            <w:r>
+              <w:rPr>
+                <w:noProof/>
+                <w:webHidden/>
+              </w:rPr>
+              <w:fldChar w:fldCharType="begin"/>
+            </w:r>
+            <w:r>
+              <w:rPr>
+                <w:noProof/>
+                <w:webHidden/>
+              </w:rPr>
+              <w:instrText xml:space="preserve"> PAGEREF _Toc241515169 \h </w:instrText>
+            </w:r>
+            <w:r>
+              <w:rPr>
+                <w:noProof/>
+                <w:webHidden/>
+              </w:rPr>
+            </w:r>
+            <w:r>
+              <w:rPr>
+                <w:noProof/>
+                <w:webHidden/>
+              </w:rPr>
+              <w:fldChar w:fldCharType="separate"/>
+            </w:r>
+            <w:r>
+              <w:rPr>
+                <w:noProof/>
+                <w:webHidden/>
+              </w:rPr>
+              <w:t>2</w:t>
+            </w:r>
+            <w:r>
+              <w:rPr>
+                <w:noProof/>
+                <w:webHidden/>
+              </w:rPr>
+              <w:fldChar w:fldCharType="end"/>
+            </w:r>
+          </w:hyperlink>
+        </w:p>
+        <w:p>
+          <w:pPr>
+            <w:pStyle w:val="TOC2"/>
+            <w:tabs>
+              <w:tab w:val="right" w:leader="dot" w:pos="9016"/>
+            </w:tabs>
+            <w:rPr>
+              <w:rFonts w:eastAsiaTheme="minorEastAsia"/>
+              <w:noProof/>
+              <w:lang w:eastAsia="en-ZA"/>
+            </w:rPr>
+          </w:pPr>
+          <w:hyperlink w:anchor="_Toc241515170" w:history="1">
+            <w:r>
+              <w:rPr>
+                <w:rStyle w:val="Hyperlink"/>
+                <w:noProof/>
+              </w:rPr>
+              <w:t>African Problem Investigation</w:t>
+            </w:r>
+            <w:r>
+              <w:rPr>
+                <w:noProof/>
+                <w:webHidden/>
+              </w:rPr>
+              <w:tab/>
+            </w:r>
+            <w:r>
+              <w:rPr>
+                <w:noProof/>
+                <w:webHidden/>
+              </w:rPr>
+              <w:fldChar w:fldCharType="begin"/>
+            </w:r>
+            <w:r>
+              <w:rPr>
+                <w:noProof/>
+                <w:webHidden/>
+              </w:rPr>
+              <w:instrText xml:space="preserve"> PAGEREF _Toc241515170 \h </w:instrText>
+            </w:r>
+            <w:r>
+              <w:rPr>
+                <w:noProof/>
+                <w:webHidden/>
+              </w:rPr>
+            </w:r>
+            <w:r>
+              <w:rPr>
+                <w:noProof/>
+                <w:webHidden/>
+              </w:rPr>
+              <w:fldChar w:fldCharType="separate"/>
+            </w:r>
+            <w:r>
+              <w:rPr>
+                <w:noProof/>
+                <w:webHidden/>
+              </w:rPr>
+              <w:t>2</w:t>
+            </w:r>
+            <w:r>
+              <w:rPr>
+                <w:noProof/>
+                <w:webHidden/>
+              </w:rPr>
+              <w:fldChar w:fldCharType="end"/>
+            </w:r>
+          </w:hyperlink>
+        </w:p>
+        <w:p>
+          <w:pPr>
+            <w:pStyle w:val="TOC2"/>
+            <w:tabs>
+              <w:tab w:val="right" w:leader="dot" w:pos="9016"/>
+            </w:tabs>
+            <w:rPr>
+              <w:rFonts w:eastAsiaTheme="minorEastAsia"/>
+              <w:noProof/>
+              <w:lang w:eastAsia="en-ZA"/>
+            </w:rPr>
+          </w:pPr>
+          <w:hyperlink w:anchor="_Toc241515171" w:history="1">
+            <w:r>
+              <w:rPr>
+                <w:rStyle w:val="Hyperlink"/>
+                <w:noProof/>
+              </w:rPr>
+              <w:t>Wireframe and AI Reflection</w:t>
+            </w:r>
+            <w:r>
+              <w:rPr>
+                <w:noProof/>
+                <w:webHidden/>
+              </w:rPr>
+              <w:tab/>
+            </w:r>
+            <w:r>
+              <w:rPr>
+                <w:noProof/>
+                <w:webHidden/>
+              </w:rPr>
+              <w:fldChar w:fldCharType="begin"/>
+            </w:r>
+            <w:r>
+              <w:rPr>
+                <w:noProof/>
+                <w:webHidden/>
+              </w:rPr>
+              <w:instrText xml:space="preserve"> PAGEREF _Toc241515171 \h </w:instrText>
+            </w:r>
+            <w:r>
+              <w:rPr>
+                <w:noProof/>
+                <w:webHidden/>
+              </w:rPr>
+            </w:r>
+            <w:r>
+              <w:rPr>
+                <w:noProof/>
+                <w:webHidden/>
+              </w:rPr>
+              <w:fldChar w:fldCharType="separate"/>
+            </w:r>
+            <w:r>
+              <w:rPr>
+                <w:noProof/>
+                <w:webHidden/>
+              </w:rPr>
+              <w:t>0</w:t>
+            </w:r>
+            <w:r>
+              <w:rPr>
+                <w:noProof/>
+                <w:webHidden/>
+              </w:rPr>
+              <w:fldChar w:fldCharType="end"/>
+            </w:r>
+          </w:hyperlink>
+        </w:p>
+        <w:p>
+          <w:pPr>
+            <w:pStyle w:val="TOC3"/>
+            <w:tabs>
+              <w:tab w:val="right" w:leader="dot" w:pos="9016"/>
+            </w:tabs>
+            <w:rPr>
+              <w:rFonts w:eastAsiaTheme="minorEastAsia"/>
+              <w:noProof/>
+              <w:lang w:eastAsia="en-ZA"/>
+            </w:rPr>
+          </w:pPr>
+          <w:hyperlink w:anchor="_Toc241515172" w:history="1">
+            <w:r>
+              <w:rPr>
+                <w:rStyle w:val="Hyperlink"/>
+                <w:noProof/>
+              </w:rPr>
+              <w:t>Wireframe</w:t>
+            </w:r>
+            <w:r>
+              <w:rPr>
+                <w:noProof/>
+                <w:webHidden/>
+              </w:rPr>
+              <w:tab/>
+            </w:r>
+            <w:r>
+              <w:rPr>
+                <w:noProof/>
+                <w:webHidden/>
+              </w:rPr>
+              <w:fldChar w:fldCharType="begin"/>
+            </w:r>
+            <w:r>
+              <w:rPr>
+                <w:noProof/>
+                <w:webHidden/>
+              </w:rPr>
+              <w:instrText xml:space="preserve"> PAGEREF _Toc241515172 \h </w:instrText>
+            </w:r>
+            <w:r>
+              <w:rPr>
+                <w:noProof/>
+                <w:webHidden/>
+              </w:rPr>
+            </w:r>
+            <w:r>
+              <w:rPr>
+                <w:noProof/>
+                <w:webHidden/>
+              </w:rPr>
+              <w:fldChar w:fldCharType="separate"/>
+            </w:r>
+            <w:r>
+              <w:rPr>
+                <w:noProof/>
+                <w:webHidden/>
+              </w:rPr>
+              <w:t>0</w:t>
+            </w:r>
+            <w:r>
+              <w:rPr>
+                <w:noProof/>
+                <w:webHidden/>
+              </w:rPr>
+              <w:fldChar w:fldCharType="end"/>
+            </w:r>
+          </w:hyperlink>
+        </w:p>
+        <w:p>
+          <w:pPr>
+            <w:pStyle w:val="TOC3"/>
+            <w:tabs>
+              <w:tab w:val="right" w:leader="dot" w:pos="9016"/>
+            </w:tabs>
+            <w:rPr>
+              <w:rFonts w:eastAsiaTheme="minorEastAsia"/>
+              <w:noProof/>
+              <w:lang w:eastAsia="en-ZA"/>
+            </w:rPr>
+          </w:pPr>
+          <w:hyperlink w:anchor="_Toc241515173" w:history="1">
+            <w:r>
+              <w:rPr>
+                <w:rStyle w:val="Hyperlink"/>
+                <w:noProof/>
+              </w:rPr>
+              <w:t>AI Usage discloser</w:t>
+            </w:r>
+            <w:r>
+              <w:rPr>
+                <w:noProof/>
+                <w:webHidden/>
+              </w:rPr>
+              <w:tab/>
+            </w:r>
+            <w:r>
+              <w:rPr>
+                <w:noProof/>
+                <w:webHidden/>
+              </w:rPr>
+              <w:fldChar w:fldCharType="begin"/>
+            </w:r>
+            <w:r>
+              <w:rPr>
+                <w:noProof/>
+                <w:webHidden/>
+              </w:rPr>
+              <w:instrText xml:space="preserve"> PAGEREF _Toc241515173 \h </w:instrText>
+            </w:r>
+            <w:r>
+              <w:rPr>
+                <w:noProof/>
+                <w:webHidden/>
+              </w:rPr>
+            </w:r>
+            <w:r>
+              <w:rPr>
+                <w:noProof/>
+                <w:webHidden/>
+              </w:rPr>
+              <w:fldChar w:fldCharType="separate"/>
+            </w:r>
+            <w:r>
+              <w:rPr>
+                <w:noProof/>
+                <w:webHidden/>
+              </w:rPr>
+              <w:t>0</w:t>
+            </w:r>
+            <w:r>
+              <w:rPr>
+                <w:noProof/>
+                <w:webHidden/>
+              </w:rPr>
+              <w:fldChar w:fldCharType="end"/>
+            </w:r>
+          </w:hyperlink>
+        </w:p>
+        <w:p>
+          <w:r>
+            <w:rPr>
+              <w:b/>
+              <w:bCs/>
+              <w:noProof/>
+            </w:rPr>
+            <w:fldChar w:fldCharType="end"/>
+          </w:r>
+        </w:p>
+      </w:sdtContent>
+    </w:sdt>
     <w:p>
+      <w:r>
+        <w:br w:type="page"/>
+      </w:r>
+    </w:p>
+    <w:p>
+      <w:pPr>
+        <w:pStyle w:val="Heading1"/>
+      </w:pPr>
+      <w:bookmarkStart w:id="0" w:name="_Toc241515166"/>
+      <w:r>
+        <w:lastRenderedPageBreak/>
+        <w:t>Task 1</w:t>
+      </w:r>
+      <w:bookmarkEnd w:id="0"/>
+    </w:p>
+    <w:p>
+      <w:pPr>
+        <w:pStyle w:val="Heading2"/>
+      </w:pPr>
+      <w:bookmarkStart w:id="1" w:name="_Toc241515167"/>
+      <w:r>
+        <w:t xml:space="preserve">GitHub Repository </w:t>
+      </w:r>
+      <w:r>
+        <w:t>Setup</w:t>
+      </w:r>
+      <w:bookmarkEnd w:id="1"/>
+    </w:p>
+    <w:p>
+      <w:pPr>
+        <w:pStyle w:val="Heading3"/>
+      </w:pPr>
+      <w:bookmarkStart w:id="2" w:name="_Toc241515168"/>
+      <w:r>
+        <w:t>Installation/Setup Instructions</w:t>
+      </w:r>
+      <w:bookmarkEnd w:id="2"/>
+    </w:p>
+    <w:p>
+      <w:r>
+        <w:t xml:space="preserve">The </w:t>
+      </w:r>
+    </w:p>
+    <w:p>
+      <w:pPr>
+        <w:pStyle w:val="Heading3"/>
+      </w:pPr>
+      <w:bookmarkStart w:id="3" w:name="_Toc241515169"/>
+      <w:r>
+        <w:t>Initial</w:t>
+      </w:r>
+      <w:r>
+        <w:t xml:space="preserve"> Folder Structure</w:t>
+      </w:r>
+      <w:bookmarkEnd w:id="3"/>
+    </w:p>
+    <w:p>
+      <w:pPr>
+        <w:pStyle w:val="ListParagraph"/>
+        <w:numPr>
+          <w:ilvl w:val="0"/>
+          <w:numId w:val="2"/>
+        </w:numPr>
+      </w:pPr>
+      <w:r>
+        <w:t>Managa_Moabelo_WebAnime_WAS262_SF1</w:t>
+      </w:r>
+    </w:p>
+    <w:p>
+      <w:pPr>
+        <w:pStyle w:val="ListParagraph"/>
+        <w:numPr>
+          <w:ilvl w:val="1"/>
+          <w:numId w:val="2"/>
+        </w:numPr>
+      </w:pPr>
+      <w:r>
+        <w:t>Index.html</w:t>
+      </w:r>
+    </w:p>
+    <w:p>
+      <w:pPr>
+        <w:pStyle w:val="ListParagraph"/>
+        <w:numPr>
+          <w:ilvl w:val="1"/>
+          <w:numId w:val="2"/>
+        </w:numPr>
+      </w:pPr>
+      <w:r>
+        <w:t>Managa_WAS262_SF1.docx</w:t>
+      </w:r>
+    </w:p>
+    <w:p>
+      <w:pPr>
+        <w:pStyle w:val="ListParagraph"/>
+        <w:numPr>
+          <w:ilvl w:val="1"/>
+          <w:numId w:val="2"/>
+        </w:numPr>
+      </w:pPr>
+      <w:r>
+        <w:t>README.md</w:t>
+      </w:r>
+    </w:p>
+    <w:p>
+      <w:pPr>
+        <w:pStyle w:val="ListParagraph"/>
+        <w:numPr>
+          <w:ilvl w:val="1"/>
+          <w:numId w:val="2"/>
+        </w:numPr>
+      </w:pPr>
+      <w:r>
+        <w:t>Script.js</w:t>
+      </w:r>
+    </w:p>
+    <w:p>
+      <w:pPr>
+        <w:pStyle w:val="ListParagraph"/>
+        <w:numPr>
+          <w:ilvl w:val="1"/>
+          <w:numId w:val="2"/>
+        </w:numPr>
+      </w:pPr>
+      <w:r>
+        <w:t>Style.css</w:t>
+      </w:r>
+    </w:p>
+    <w:p>
+      <w:pPr>
+        <w:pStyle w:val="ListParagraph"/>
+        <w:numPr>
+          <w:ilvl w:val="1"/>
+          <w:numId w:val="2"/>
+        </w:numPr>
+      </w:pPr>
+      <w:r>
+        <w:t>Wireframes.svg</w:t>
+      </w:r>
+    </w:p>
+    <w:p>
+      <w:pPr>
+        <w:pStyle w:val="ListParagraph"/>
+        <w:numPr>
+          <w:ilvl w:val="0"/>
+          <w:numId w:val="2"/>
+        </w:numPr>
+      </w:pPr>
+      <w:r>
+        <w:t>Assets</w:t>
+      </w:r>
+    </w:p>
+    <w:p>
+      <w:pPr>
+        <w:pStyle w:val="ListParagraph"/>
+        <w:numPr>
+          <w:ilvl w:val="1"/>
+          <w:numId w:val="2"/>
+        </w:numPr>
+      </w:pPr>
+      <w:r>
+        <w:t>So</w:t>
+      </w:r>
+      <w:r>
+        <w:t>unds</w:t>
+      </w:r>
+    </w:p>
+    <w:p>
+      <w:pPr>
+        <w:pStyle w:val="ListParagraph"/>
+        <w:numPr>
+          <w:ilvl w:val="2"/>
+          <w:numId w:val="2"/>
+        </w:numPr>
+      </w:pPr>
+      <w:r>
+        <w:t>Background.mp3</w:t>
+      </w:r>
+    </w:p>
+    <w:p>
+      <w:pPr>
+        <w:pStyle w:val="ListParagraph"/>
+        <w:numPr>
+          <w:ilvl w:val="2"/>
+          <w:numId w:val="2"/>
+        </w:numPr>
+      </w:pPr>
+      <w:r>
+        <w:t>Collision.</w:t>
+      </w:r>
+      <w:r>
+        <w:t>mp3</w:t>
+      </w:r>
+    </w:p>
+    <w:p>
+      <w:pPr>
+        <w:pStyle w:val="ListParagraph"/>
+        <w:numPr>
+          <w:ilvl w:val="2"/>
+          <w:numId w:val="2"/>
+        </w:numPr>
+      </w:pPr>
+      <w:r>
+        <w:t>Move.</w:t>
+      </w:r>
+      <w:r>
+        <w:t>mp3</w:t>
+      </w:r>
+    </w:p>
+    <w:p>
+      <w:pPr>
+        <w:pStyle w:val="Heading2"/>
+      </w:pPr>
+      <w:bookmarkStart w:id="4" w:name="_Toc241515170"/>
+      <w:r>
+        <w:t>African Problem Investigation</w:t>
+      </w:r>
+      <w:bookmarkEnd w:id="4"/>
+    </w:p>
+    <w:p>
+      <w:r>
+        <w:t xml:space="preserve">The problem we are trying to address with EcoDash is how load-shedding can affect deliveries and access to essential resources in South Africa. The project uses a drone to deliver resources while navigating through urban environments such as Johannesburg, where electricity interruptions can affect normal delivery and charging infrastructure. The drone must also avoid environmental obstacles such as birds, buildings, and other objects while delivering resources to small buildings. Trigonometry and vector mathematics are used in EcoDash to simulate realistic drone movement and environmental challenges. The drone uses Math.cos(this.angle) to calculate its horizontal movement and Math.sin(this.angle) to calculate its vertical movement, allowing it to travel in the direction it is facing. Vector mathematics is also used to simulate wind by applying windForce, which pushes the drone sideways and represents a crosswind. Friction gradually reduces the drone's speed when it is not accelerating, simulating resistance from the environment. Distance calculations using the x and y differences between objects are used to detect collisions with birds and other obstacles. The game also includes battery drain while the drone is moving, requiring the player to manage energy and use charging zones, while load-shedding can disable the charging zones. Rain, wind, friction, battery consumption, and collision detection </w:t>
+      </w:r>
+      <w:r>
+        <w:lastRenderedPageBreak/>
+        <w:t>therefore create environmental challenges that affect gameplay and require the player to manage the drone's movement, safety, and resources</w:t>
+      </w:r>
+      <w:r>
+        <w:t>.</w:t>
+      </w:r>
+    </w:p>
+    <w:p>
+      <w:pPr>
+        <w:sectPr>
+          <w:pgSz w:w="11906" w:h="16838"/>
+          <w:pgMar w:top="1440" w:right="1440" w:bottom="1440" w:left="1440" w:header="708" w:footer="708" w:gutter="0"/>
+          <w:pgNumType w:start="0"/>
+          <w:cols w:space="708"/>
+          <w:titlePg/>
+          <w:docGrid w:linePitch="360"/>
+        </w:sectPr>
+      </w:pPr>
+    </w:p>
+    <w:p>
+      <w:pPr>
+        <w:pStyle w:val="Heading2"/>
+      </w:pPr>
+      <w:bookmarkStart w:id="5" w:name="_Toc241515171"/>
+      <w:r>
+        <w:lastRenderedPageBreak/>
+        <w:t>Wireframe and AI Reflection</w:t>
+      </w:r>
+      <w:bookmarkEnd w:id="5"/>
+    </w:p>
+    <w:p>
+      <w:pPr>
+        <w:pStyle w:val="Heading3"/>
+      </w:pPr>
+      <w:bookmarkStart w:id="6" w:name="_Toc241515172"/>
+      <w:r>
+        <w:t>Wireframe</w:t>
+      </w:r>
+      <w:bookmarkEnd w:id="6"/>
+    </w:p>
+    <w:p>
+      <w:r>
+        <w:drawing>
+          <wp:inline distT="0" distB="0" distL="0" distR="0" wp14:anchorId="2C574292" wp14:editId="7FF82493">
+            <wp:extent cx="9876155" cy="5931876"/>
+            <wp:effectExtent l="0" t="0" r="0" b="0"/>
+            <wp:docPr id="1718309349" name="Graphic 1"/>
+            <wp:cNvGraphicFramePr>
+              <a:graphicFrameLocks xmlns:a="http://schemas.openxmlformats.org/drawingml/2006/main" noChangeAspect="1"/>
+            </wp:cNvGraphicFramePr>
+            <a:graphic xmlns:a="http://schemas.openxmlformats.org/drawingml/2006/main">
+              <a:graphicData uri="http://schemas.openxmlformats.org/drawingml/2006/picture">
+                <pic:pic xmlns:pic="http://schemas.openxmlformats.org/drawingml/2006/picture">
+                  <pic:nvPicPr>
+                    <pic:cNvPr id="1718309349" name=""/>
+                    <pic:cNvPicPr/>
+                  </pic:nvPicPr>
+                  <pic:blipFill>
+                    <a:blip r:embed="rId9">
+                      <a:extLst>
+                        <a:ext uri="{96DAC541-7B7A-43D3-8B79-37D633B846F1}">
+                          <asvg:svgBlip xmlns:asvg="http://schemas.microsoft.com/office/drawing/2016/SVG/main" r:embed="rId10"/>
+                        </a:ext>
+                      </a:extLst>
+                    </a:blip>
+                    <a:stretch>
+                      <a:fillRect/>
+                    </a:stretch>
+                  </pic:blipFill>
+                  <pic:spPr>
+                    <a:xfrm>
+                      <a:off x="0" y="0"/>
+                      <a:ext cx="9971446" cy="5989110"/>
+                    </a:xfrm>
+                    <a:prstGeom prst="rect">
+                      <a:avLst/>
+                    </a:prstGeom>
+                  </pic:spPr>
+                </pic:pic>
+              </a:graphicData>
+            </a:graphic>
+          </wp:inline>
+        </w:drawing>
+      </w:r>
+    </w:p>
+    <w:p>
+      <w:pPr>
+        <w:sectPr>
+          <w:pgSz w:w="16838" w:h="11906" w:orient="landscape"/>
+          <w:pgMar w:top="720" w:right="720" w:bottom="720" w:left="720" w:header="708" w:footer="708" w:gutter="0"/>
+          <w:pgNumType w:start="0"/>
+          <w:cols w:space="708"/>
+          <w:titlePg/>
+          <w:docGrid w:linePitch="360"/>
+        </w:sectPr>
+      </w:pPr>
+    </w:p>
+    <w:p>
+      <w:pPr>
+        <w:pStyle w:val="Heading3"/>
+      </w:pPr>
+      <w:bookmarkStart w:id="7" w:name="_Toc241515173"/>
       <w:r>
         <w:lastRenderedPageBreak/>
         <w:t>AI Usage discloser</w:t>
       </w:r>
+      <w:bookmarkEnd w:id="7"/>
     </w:p>
     <w:tbl>
       <w:tblPr>
@@ -867,10 +1808,7 @@
           </w:tcPr>
           <w:p>
             <w:r>
-              <w:t xml:space="preserve">Provided </w:t>
-            </w:r>
-            <w:r>
-              <w:t>base logic for collision sound</w:t>
+              <w:t>Provided base logic for collision sound</w:t>
             </w:r>
           </w:p>
         </w:tc>
@@ -880,10 +1818,7 @@
           </w:tcPr>
           <w:p>
             <w:r>
-              <w:t xml:space="preserve">Added </w:t>
-            </w:r>
-            <w:r>
-              <w:t>collision sounds</w:t>
+              <w:t>Added collision sounds</w:t>
             </w:r>
           </w:p>
         </w:tc>
@@ -895,10 +1830,7 @@
           </w:tcPr>
           <w:p>
             <w:r>
-              <w:t xml:space="preserve">How to add </w:t>
-            </w:r>
-            <w:r>
-              <w:t>move sound</w:t>
+              <w:t>How to add move sound</w:t>
             </w:r>
           </w:p>
         </w:tc>
@@ -918,16 +1850,7 @@
           </w:tcPr>
           <w:p>
             <w:r>
-              <w:t xml:space="preserve">Added </w:t>
-            </w:r>
-            <w:r>
-              <w:t>moving sou</w:t>
-            </w:r>
-            <w:r>
-              <w:t>n</w:t>
-            </w:r>
-            <w:r>
-              <w:t>ds</w:t>
+              <w:t>Added moving sounds</w:t>
             </w:r>
           </w:p>
         </w:tc>
@@ -971,13 +1894,7 @@
           </w:tcPr>
           <w:p>
             <w:r>
-              <w:t>How can I add weather patterns like rain</w:t>
-            </w:r>
-            <w:r>
-              <w:t xml:space="preserve">, </w:t>
-            </w:r>
-            <w:r>
-              <w:t>wind,</w:t>
+              <w:t>How can I add weather patterns like rain, wind,</w:t>
             </w:r>
           </w:p>
         </w:tc>
@@ -1009,25 +1926,7 @@
           </w:tcPr>
           <w:p>
             <w:r>
-              <w:t xml:space="preserve">Where can I find </w:t>
-            </w:r>
-            <w:r>
-              <w:t>background</w:t>
-            </w:r>
-            <w:r>
-              <w:t xml:space="preserve"> music</w:t>
-            </w:r>
-            <w:r>
-              <w:t xml:space="preserve">, </w:t>
-            </w:r>
-            <w:r>
-              <w:t>movement</w:t>
-            </w:r>
-            <w:r>
-              <w:t>,</w:t>
-            </w:r>
-            <w:r>
-              <w:t xml:space="preserve"> and collision sounds</w:t>
+              <w:t>Where can I find background music, movement, and collision sounds</w:t>
             </w:r>
           </w:p>
         </w:tc>
@@ -1037,16 +1936,7 @@
           </w:tcPr>
           <w:p>
             <w:r>
-              <w:t xml:space="preserve">Provided sources to </w:t>
-            </w:r>
-            <w:r>
-              <w:t xml:space="preserve">background music, </w:t>
-            </w:r>
-            <w:r>
-              <w:t xml:space="preserve">movement and collision sounds that </w:t>
-            </w:r>
-            <w:r>
-              <w:t>are royalty free</w:t>
+              <w:t>Provided sources to background music, movement and collision sounds that are royalty free</w:t>
             </w:r>
           </w:p>
         </w:tc>
@@ -1056,19 +1946,7 @@
           </w:tcPr>
           <w:p>
             <w:r>
-              <w:t xml:space="preserve">Included </w:t>
-            </w:r>
-            <w:r>
-              <w:t>background</w:t>
-            </w:r>
-            <w:r>
-              <w:t xml:space="preserve"> music</w:t>
-            </w:r>
-            <w:r>
-              <w:t xml:space="preserve">, </w:t>
-            </w:r>
-            <w:r>
-              <w:t>movement and collision sounds</w:t>
+              <w:t>Included background music, movement and collision sounds</w:t>
             </w:r>
           </w:p>
         </w:tc>
@@ -1080,10 +1958,7 @@
           </w:tcPr>
           <w:p>
             <w:r>
-              <w:t>How to</w:t>
-            </w:r>
-            <w:r>
-              <w:t xml:space="preserve"> get day and night cycles</w:t>
+              <w:t>How to get day and night cycles</w:t>
             </w:r>
           </w:p>
         </w:tc>
@@ -1115,16 +1990,7 @@
           </w:tcPr>
           <w:p>
             <w:r>
-              <w:t xml:space="preserve">How </w:t>
-            </w:r>
-            <w:r>
-              <w:t>to code and get start, pause</w:t>
-            </w:r>
-            <w:r>
-              <w:t>, restart</w:t>
-            </w:r>
-            <w:r>
-              <w:t>, and game over screens</w:t>
+              <w:t>How to code and get start, pause, restart, and game over screens</w:t>
             </w:r>
           </w:p>
         </w:tc>
@@ -1134,13 +2000,7 @@
           </w:tcPr>
           <w:p>
             <w:r>
-              <w:t>Provided source codes for pause menu</w:t>
-            </w:r>
-            <w:r>
-              <w:t>, restart menu</w:t>
-            </w:r>
-            <w:r>
-              <w:t>, start menu, and game over menu screens</w:t>
+              <w:t>Provided source codes for pause menu, restart menu, start menu, and game over menu screens</w:t>
             </w:r>
           </w:p>
         </w:tc>
@@ -1150,22 +2010,7 @@
           </w:tcPr>
           <w:p>
             <w:r>
-              <w:t>Added</w:t>
-            </w:r>
-            <w:r>
-              <w:t xml:space="preserve"> </w:t>
-            </w:r>
-            <w:r>
-              <w:t>pause menu, restart menu</w:t>
-            </w:r>
-            <w:r>
-              <w:t>,</w:t>
-            </w:r>
-            <w:r>
-              <w:t xml:space="preserve"> </w:t>
-            </w:r>
-            <w:r>
-              <w:t>start menu, and game over menu screens</w:t>
+              <w:t>Added pause menu, restart menu, start menu, and game over menu screens</w:t>
             </w:r>
           </w:p>
         </w:tc>
@@ -1187,10 +2032,7 @@
           </w:tcPr>
           <w:p>
             <w:r>
-              <w:t xml:space="preserve">Provided </w:t>
-            </w:r>
-            <w:r>
-              <w:t>score system code with local feature</w:t>
+              <w:t>Provided score system code with local feature</w:t>
             </w:r>
           </w:p>
         </w:tc>
@@ -1200,21 +2042,81 @@
           </w:tcPr>
           <w:p>
             <w:r>
-              <w:t xml:space="preserve">Added </w:t>
-            </w:r>
-            <w:r>
-              <w:t xml:space="preserve">score system code with local </w:t>
-            </w:r>
-            <w:r>
-              <w:t xml:space="preserve">save </w:t>
-            </w:r>
-            <w:r>
-              <w:t>feature</w:t>
+              <w:t>Added score system code with local save feature</w:t>
             </w:r>
           </w:p>
         </w:tc>
       </w:tr>
     </w:tbl>
+    <w:p/>
+    <w:p>
+      <w:r>
+        <w:br w:type="page"/>
+      </w:r>
+    </w:p>
+    <w:sdt>
+      <w:sdtPr>
+        <w:id w:val="-508057943"/>
+        <w:docPartObj>
+          <w:docPartGallery w:val="Bibliographies"/>
+          <w:docPartUnique/>
+        </w:docPartObj>
+      </w:sdtPr>
+      <w:sdtEndPr>
+        <w:rPr>
+          <w:rFonts w:asciiTheme="minorHAnsi" w:eastAsiaTheme="minorHAnsi" w:hAnsiTheme="minorHAnsi" w:cstheme="minorBidi"/>
+          <w:color w:val="auto"/>
+          <w:sz w:val="24"/>
+          <w:szCs w:val="24"/>
+        </w:rPr>
+      </w:sdtEndPr>
+      <w:sdtContent>
+        <w:p>
+          <w:pPr>
+            <w:pStyle w:val="Heading1"/>
+          </w:pPr>
+          <w:r>
+            <w:t>References</w:t>
+          </w:r>
+        </w:p>
+        <w:sdt>
+          <w:sdtPr>
+            <w:id w:val="-573587230"/>
+            <w:bibliography/>
+          </w:sdtPr>
+          <w:sdtContent>
+            <w:p>
+              <w:r>
+                <w:fldChar w:fldCharType="begin"/>
+              </w:r>
+              <w:r>
+                <w:instrText xml:space="preserve"> BIBLIOGRAPHY </w:instrText>
+              </w:r>
+              <w:r>
+                <w:fldChar w:fldCharType="separate"/>
+              </w:r>
+              <w:r>
+                <w:rPr>
+                  <w:b/>
+                  <w:bCs/>
+                  <w:noProof/>
+                  <w:lang w:val="en-US"/>
+                </w:rPr>
+                <w:t>There are no sources in the current document.</w:t>
+              </w:r>
+              <w:r>
+                <w:rPr>
+                  <w:b/>
+                  <w:bCs/>
+                  <w:noProof/>
+                </w:rPr>
+                <w:fldChar w:fldCharType="end"/>
+              </w:r>
+            </w:p>
+          </w:sdtContent>
+        </w:sdt>
+      </w:sdtContent>
+    </w:sdt>
     <w:p/>
     <w:sectPr>
       <w:pgSz w:w="11906" w:h="16838"/>
@@ -1226,6 +2128,243 @@
     </w:sectPr>
   </w:body>
 </w:document>
+</file>
+
+<file path=word/numbering.xml><?xml version="1.0" encoding="utf-8"?>
+<w:numbering xmlns:wpc="http://schemas.microsoft.com/office/word/2010/wordprocessingCanvas" xmlns:cx="http://schemas.microsoft.com/office/drawing/2014/chartex" xmlns:cx1="http://schemas.microsoft.com/office/drawing/2015/9/8/chartex" xmlns:cx2="http://schemas.microsoft.com/office/drawing/2015/10/21/chartex" xmlns:cx3="http://schemas.microsoft.com/office/drawing/2016/5/9/chartex" xmlns:cx4="http://schemas.microsoft.com/office/drawing/2016/5/10/chartex" xmlns:cx5="http://schemas.microsoft.com/office/drawing/2016/5/11/chartex" xmlns:cx6="http://schemas.microsoft.com/office/drawing/2016/5/12/chartex" xmlns:cx7="http://schemas.microsoft.com/office/drawing/2016/5/13/chartex" xmlns:cx8="http://schemas.microsoft.com/office/drawing/2016/5/14/chartex" xmlns:mc="http://schemas.openxmlformats.org/markup-compatibility/2006" xmlns:aink="http://schemas.microsoft.com/office/drawing/2016/ink" xmlns:am3d="http://schemas.microsoft.com/office/drawing/2017/model3d" xmlns:o="urn:schemas-microsoft-com:office:office" xmlns:oel="http://schemas.microsoft.com/office/2019/extlst" xmlns:r="http://schemas.openxmlformats.org/officeDocument/2006/relationships" xmlns:m="http://schemas.openxmlformats.org/officeDocument/2006/math" xmlns:v="urn:schemas-microsoft-com:vml" xmlns:wp14="http://schemas.microsoft.com/office/word/2010/wordprocessingDrawing" xmlns:wp="http://schemas.openxmlformats.org/drawingml/2006/wordprocessingDrawing" xmlns:w10="urn:schemas-microsoft-com:office:word" xmlns:w="http://schemas.openxmlformats.org/wordprocessingml/2006/main" xmlns:w14="http://schemas.microsoft.com/office/word/2010/wordml" xmlns:w15="http://schemas.microsoft.com/office/word/2012/wordml" xmlns:w16cex="http://schemas.microsoft.com/office/word/2018/wordml/cex" xmlns:w16cid="http://schemas.microsoft.com/office/word/2016/wordml/cid" xmlns:w16="http://schemas.microsoft.com/office/word/2018/wordml" xmlns:w16du="http://schemas.microsoft.com/office/word/2023/wordml/word16du" xmlns:w16sdtdh="http://schemas.microsoft.com/office/word/2020/wordml/sdtdatahash" xmlns:w16sdtfl="http://schemas.microsoft.com/office/word/2024/wordml/sdtformatlock" xmlns:w16se="http://schemas.microsoft.com/office/word/2015/wordml/symex" xmlns:wpg="http://schemas.microsoft.com/office/word/2010/wordprocessingGroup" xmlns:wpi="http://schemas.microsoft.com/office/word/2010/wordprocessingInk" xmlns:wne="http://schemas.microsoft.com/office/word/2006/wordml" xmlns:wps="http://schemas.microsoft.com/office/word/2010/wordprocessingShape" mc:Ignorable="w14 w15 w16se w16cid w16 w16cex w16sdtdh w16sdtfl w16du wp14">
+  <w:abstractNum w:abstractNumId="0" w15:restartNumberingAfterBreak="0">
+    <w:nsid w:val="099D0A66"/>
+    <w:multiLevelType w:val="multilevel"/>
+    <w:tmpl w:val="F990A686"/>
+    <w:lvl w:ilvl="0">
+      <w:start w:val="1"/>
+      <w:numFmt w:val="decimal"/>
+      <w:lvlText w:val="%1"/>
+      <w:lvlJc w:val="left"/>
+      <w:pPr>
+        <w:ind w:left="480" w:hanging="480"/>
+      </w:pPr>
+      <w:rPr>
+        <w:rFonts w:hint="default"/>
+      </w:rPr>
+    </w:lvl>
+    <w:lvl w:ilvl="1">
+      <w:start w:val="1"/>
+      <w:numFmt w:val="decimal"/>
+      <w:lvlText w:val="%1.%2"/>
+      <w:lvlJc w:val="left"/>
+      <w:pPr>
+        <w:ind w:left="480" w:hanging="480"/>
+      </w:pPr>
+      <w:rPr>
+        <w:rFonts w:hint="default"/>
+      </w:rPr>
+    </w:lvl>
+    <w:lvl w:ilvl="2">
+      <w:start w:val="1"/>
+      <w:numFmt w:val="decimal"/>
+      <w:lvlText w:val="%1.%2.%3"/>
+      <w:lvlJc w:val="left"/>
+      <w:pPr>
+        <w:ind w:left="720" w:hanging="720"/>
+      </w:pPr>
+      <w:rPr>
+        <w:rFonts w:hint="default"/>
+      </w:rPr>
+    </w:lvl>
+    <w:lvl w:ilvl="3">
+      <w:start w:val="1"/>
+      <w:numFmt w:val="decimal"/>
+      <w:lvlText w:val="%1.%2.%3.%4"/>
+      <w:lvlJc w:val="left"/>
+      <w:pPr>
+        <w:ind w:left="1080" w:hanging="1080"/>
+      </w:pPr>
+      <w:rPr>
+        <w:rFonts w:hint="default"/>
+      </w:rPr>
+    </w:lvl>
+    <w:lvl w:ilvl="4">
+      <w:start w:val="1"/>
+      <w:numFmt w:val="decimal"/>
+      <w:lvlText w:val="%1.%2.%3.%4.%5"/>
+      <w:lvlJc w:val="left"/>
+      <w:pPr>
+        <w:ind w:left="1080" w:hanging="1080"/>
+      </w:pPr>
+      <w:rPr>
+        <w:rFonts w:hint="default"/>
+      </w:rPr>
+    </w:lvl>
+    <w:lvl w:ilvl="5">
+      <w:start w:val="1"/>
+      <w:numFmt w:val="decimal"/>
+      <w:lvlText w:val="%1.%2.%3.%4.%5.%6"/>
+      <w:lvlJc w:val="left"/>
+      <w:pPr>
+        <w:ind w:left="1440" w:hanging="1440"/>
+      </w:pPr>
+      <w:rPr>
+        <w:rFonts w:hint="default"/>
+      </w:rPr>
+    </w:lvl>
+    <w:lvl w:ilvl="6">
+      <w:start w:val="1"/>
+      <w:numFmt w:val="decimal"/>
+      <w:lvlText w:val="%1.%2.%3.%4.%5.%6.%7"/>
+      <w:lvlJc w:val="left"/>
+      <w:pPr>
+        <w:ind w:left="1440" w:hanging="1440"/>
+      </w:pPr>
+      <w:rPr>
+        <w:rFonts w:hint="default"/>
+      </w:rPr>
+    </w:lvl>
+    <w:lvl w:ilvl="7">
+      <w:start w:val="1"/>
+      <w:numFmt w:val="decimal"/>
+      <w:lvlText w:val="%1.%2.%3.%4.%5.%6.%7.%8"/>
+      <w:lvlJc w:val="left"/>
+      <w:pPr>
+        <w:ind w:left="1800" w:hanging="1800"/>
+      </w:pPr>
+      <w:rPr>
+        <w:rFonts w:hint="default"/>
+      </w:rPr>
+    </w:lvl>
+    <w:lvl w:ilvl="8">
+      <w:start w:val="1"/>
+      <w:numFmt w:val="decimal"/>
+      <w:lvlText w:val="%1.%2.%3.%4.%5.%6.%7.%8.%9"/>
+      <w:lvlJc w:val="left"/>
+      <w:pPr>
+        <w:ind w:left="1800" w:hanging="1800"/>
+      </w:pPr>
+      <w:rPr>
+        <w:rFonts w:hint="default"/>
+      </w:rPr>
+    </w:lvl>
+  </w:abstractNum>
+  <w:abstractNum w:abstractNumId="1" w15:restartNumberingAfterBreak="0">
+    <w:nsid w:val="490E54F7"/>
+    <w:multiLevelType w:val="hybridMultilevel"/>
+    <w:tmpl w:val="A8C4E19E"/>
+    <w:lvl w:ilvl="0" w:tplc="1C090001">
+      <w:start w:val="1"/>
+      <w:numFmt w:val="bullet"/>
+      <w:lvlText w:val=""/>
+      <w:lvlJc w:val="left"/>
+      <w:pPr>
+        <w:ind w:left="720" w:hanging="360"/>
+      </w:pPr>
+      <w:rPr>
+        <w:rFonts w:ascii="Symbol" w:hAnsi="Symbol" w:hint="default"/>
+      </w:rPr>
+    </w:lvl>
+    <w:lvl w:ilvl="1" w:tplc="1C090003">
+      <w:start w:val="1"/>
+      <w:numFmt w:val="bullet"/>
+      <w:lvlText w:val="o"/>
+      <w:lvlJc w:val="left"/>
+      <w:pPr>
+        <w:ind w:left="1440" w:hanging="360"/>
+      </w:pPr>
+      <w:rPr>
+        <w:rFonts w:ascii="Courier New" w:hAnsi="Courier New" w:cs="Courier New" w:hint="default"/>
+      </w:rPr>
+    </w:lvl>
+    <w:lvl w:ilvl="2" w:tplc="1C090005">
+      <w:start w:val="1"/>
+      <w:numFmt w:val="bullet"/>
+      <w:lvlText w:val=""/>
+      <w:lvlJc w:val="left"/>
+      <w:pPr>
+        <w:ind w:left="2160" w:hanging="360"/>
+      </w:pPr>
+      <w:rPr>
+        <w:rFonts w:ascii="Wingdings" w:hAnsi="Wingdings" w:hint="default"/>
+      </w:rPr>
+    </w:lvl>
+    <w:lvl w:ilvl="3" w:tplc="1C090001" w:tentative="1">
+      <w:start w:val="1"/>
+      <w:numFmt w:val="bullet"/>
+      <w:lvlText w:val=""/>
+      <w:lvlJc w:val="left"/>
+      <w:pPr>
+        <w:ind w:left="2880" w:hanging="360"/>
+      </w:pPr>
+      <w:rPr>
+        <w:rFonts w:ascii="Symbol" w:hAnsi="Symbol" w:hint="default"/>
+      </w:rPr>
+    </w:lvl>
+    <w:lvl w:ilvl="4" w:tplc="1C090003" w:tentative="1">
+      <w:start w:val="1"/>
+      <w:numFmt w:val="bullet"/>
+      <w:lvlText w:val="o"/>
+      <w:lvlJc w:val="left"/>
+      <w:pPr>
+        <w:ind w:left="3600" w:hanging="360"/>
+      </w:pPr>
+      <w:rPr>
+        <w:rFonts w:ascii="Courier New" w:hAnsi="Courier New" w:cs="Courier New" w:hint="default"/>
+      </w:rPr>
+    </w:lvl>
+    <w:lvl w:ilvl="5" w:tplc="1C090005" w:tentative="1">
+      <w:start w:val="1"/>
+      <w:numFmt w:val="bullet"/>
+      <w:lvlText w:val=""/>
+      <w:lvlJc w:val="left"/>
+      <w:pPr>
+        <w:ind w:left="4320" w:hanging="360"/>
+      </w:pPr>
+      <w:rPr>
+        <w:rFonts w:ascii="Wingdings" w:hAnsi="Wingdings" w:hint="default"/>
+      </w:rPr>
+    </w:lvl>
+    <w:lvl w:ilvl="6" w:tplc="1C090001" w:tentative="1">
+      <w:start w:val="1"/>
+      <w:numFmt w:val="bullet"/>
+      <w:lvlText w:val=""/>
+      <w:lvlJc w:val="left"/>
+      <w:pPr>
+        <w:ind w:left="5040" w:hanging="360"/>
+      </w:pPr>
+      <w:rPr>
+        <w:rFonts w:ascii="Symbol" w:hAnsi="Symbol" w:hint="default"/>
+      </w:rPr>
+    </w:lvl>
+    <w:lvl w:ilvl="7" w:tplc="1C090003" w:tentative="1">
+      <w:start w:val="1"/>
+      <w:numFmt w:val="bullet"/>
+      <w:lvlText w:val="o"/>
+      <w:lvlJc w:val="left"/>
+      <w:pPr>
+        <w:ind w:left="5760" w:hanging="360"/>
+      </w:pPr>
+      <w:rPr>
+        <w:rFonts w:ascii="Courier New" w:hAnsi="Courier New" w:cs="Courier New" w:hint="default"/>
+      </w:rPr>
+    </w:lvl>
+    <w:lvl w:ilvl="8" w:tplc="1C090005" w:tentative="1">
+      <w:start w:val="1"/>
+      <w:numFmt w:val="bullet"/>
+      <w:lvlText w:val=""/>
+      <w:lvlJc w:val="left"/>
+      <w:pPr>
+        <w:ind w:left="6480" w:hanging="360"/>
+      </w:pPr>
+      <w:rPr>
+        <w:rFonts w:ascii="Wingdings" w:hAnsi="Wingdings" w:hint="default"/>
+      </w:rPr>
+    </w:lvl>
+  </w:abstractNum>
+  <w:num w:numId="1" w16cid:durableId="1895382598">
+    <w:abstractNumId w:val="0"/>
+  </w:num>
+  <w:num w:numId="2" w16cid:durableId="552158447">
+    <w:abstractNumId w:val="1"/>
+  </w:num>
+</w:numbering>
 </file>
 
 <file path=word/styles.xml><?xml version="1.0" encoding="utf-8"?>
@@ -1656,7 +2795,6 @@
     <w:next w:val="Normal"/>
     <w:link w:val="Heading2Char"/>
     <w:uiPriority w:val="9"/>
-    <w:semiHidden/>
     <w:unhideWhenUsed/>
     <w:qFormat/>
     <w:rsid w:val="00252C25"/>
@@ -1679,7 +2817,6 @@
     <w:next w:val="Normal"/>
     <w:link w:val="Heading3Char"/>
     <w:uiPriority w:val="9"/>
-    <w:semiHidden/>
     <w:unhideWhenUsed/>
     <w:qFormat/>
     <w:rsid w:val="00252C25"/>
@@ -1831,6 +2968,7 @@
   <w:style w:type="character" w:default="1" w:styleId="DefaultParagraphFont">
     <w:name w:val="Default Paragraph Font"/>
     <w:uiPriority w:val="1"/>
+    <w:semiHidden/>
     <w:unhideWhenUsed/>
   </w:style>
   <w:style w:type="table" w:default="1" w:styleId="TableNormal">
@@ -1872,7 +3010,6 @@
     <w:basedOn w:val="DefaultParagraphFont"/>
     <w:link w:val="Heading2"/>
     <w:uiPriority w:val="9"/>
-    <w:semiHidden/>
     <w:rsid w:val="00252C25"/>
     <w:rPr>
       <w:rFonts w:asciiTheme="majorHAnsi" w:eastAsiaTheme="majorEastAsia" w:hAnsiTheme="majorHAnsi" w:cstheme="majorBidi"/>
@@ -1886,7 +3023,6 @@
     <w:basedOn w:val="DefaultParagraphFont"/>
     <w:link w:val="Heading3"/>
     <w:uiPriority w:val="9"/>
-    <w:semiHidden/>
     <w:rsid w:val="00252C25"/>
     <w:rPr>
       <w:rFonts w:eastAsiaTheme="majorEastAsia" w:cstheme="majorBidi"/>
@@ -2195,6 +3331,75 @@
         <w:insideV w:val="single" w:sz="4" w:space="0" w:color="auto"/>
       </w:tblBorders>
     </w:tblPr>
+  </w:style>
+  <w:style w:type="paragraph" w:styleId="TOCHeading">
+    <w:name w:val="TOC Heading"/>
+    <w:basedOn w:val="Heading1"/>
+    <w:next w:val="Normal"/>
+    <w:uiPriority w:val="39"/>
+    <w:unhideWhenUsed/>
+    <w:qFormat/>
+    <w:rsid w:val="008C2A42"/>
+    <w:pPr>
+      <w:spacing w:before="240" w:after="0" w:line="259" w:lineRule="auto"/>
+      <w:outlineLvl w:val="9"/>
+    </w:pPr>
+    <w:rPr>
+      <w:kern w:val="0"/>
+      <w:sz w:val="32"/>
+      <w:szCs w:val="32"/>
+      <w:lang w:val="en-US"/>
+      <w14:ligatures w14:val="none"/>
+    </w:rPr>
+  </w:style>
+  <w:style w:type="paragraph" w:styleId="TOC1">
+    <w:name w:val="toc 1"/>
+    <w:basedOn w:val="Normal"/>
+    <w:next w:val="Normal"/>
+    <w:autoRedefine/>
+    <w:uiPriority w:val="39"/>
+    <w:unhideWhenUsed/>
+    <w:rsid w:val="008C2A42"/>
+    <w:pPr>
+      <w:spacing w:after="100"/>
+    </w:pPr>
+  </w:style>
+  <w:style w:type="paragraph" w:styleId="TOC2">
+    <w:name w:val="toc 2"/>
+    <w:basedOn w:val="Normal"/>
+    <w:next w:val="Normal"/>
+    <w:autoRedefine/>
+    <w:uiPriority w:val="39"/>
+    <w:unhideWhenUsed/>
+    <w:rsid w:val="008C2A42"/>
+    <w:pPr>
+      <w:spacing w:after="100"/>
+      <w:ind w:left="240"/>
+    </w:pPr>
+  </w:style>
+  <w:style w:type="paragraph" w:styleId="TOC3">
+    <w:name w:val="toc 3"/>
+    <w:basedOn w:val="Normal"/>
+    <w:next w:val="Normal"/>
+    <w:autoRedefine/>
+    <w:uiPriority w:val="39"/>
+    <w:unhideWhenUsed/>
+    <w:rsid w:val="008C2A42"/>
+    <w:pPr>
+      <w:spacing w:after="100"/>
+      <w:ind w:left="480"/>
+    </w:pPr>
+  </w:style>
+  <w:style w:type="character" w:styleId="Hyperlink">
+    <w:name w:val="Hyperlink"/>
+    <w:basedOn w:val="DefaultParagraphFont"/>
+    <w:uiPriority w:val="99"/>
+    <w:unhideWhenUsed/>
+    <w:rsid w:val="008C2A42"/>
+    <w:rPr>
+      <w:color w:val="467886" w:themeColor="hyperlink"/>
+      <w:u w:val="single"/>
+    </w:rPr>
   </w:style>
 </w:styles>
 </file>
@@ -2525,10 +3730,61 @@
 </CoverPageProperties>
 </file>
 
+<file path=customXml/item2.xml><?xml version="1.0" encoding="utf-8"?>
+<b:Sources xmlns:b="http://schemas.openxmlformats.org/officeDocument/2006/bibliography" xmlns="http://schemas.openxmlformats.org/officeDocument/2006/bibliography" SelectedStyle="\HarvardAnglia2008OfficeOnline.xsl" StyleName="Harvard - Anglia" Version="2008">
+  <b:Source>
+    <b:Tag>Xtr23</b:Tag>
+    <b:SourceType>InternetSite</b:SourceType>
+    <b:Guid>{27C216B1-B9E4-4418-8E41-46F6A3EF5074}</b:Guid>
+    <b:Title>Pixabay</b:Title>
+    <b:Year>2023</b:Year>
+    <b:YearAccessed>2026</b:YearAccessed>
+    <b:MonthAccessed>September</b:MonthAccessed>
+    <b:DayAccessed>28</b:DayAccessed>
+    <b:URL>https://pixabay.com/music/video-games-game-music-loop-10-145572/</b:URL>
+    <b:Month>April</b:Month>
+    <b:Day>10</b:Day>
+    <b:Author>
+      <b:Author>
+        <b:Corporate>XtremeFreddy</b:Corporate>
+      </b:Author>
+    </b:Author>
+    <b:RefOrder>1</b:RefOrder>
+  </b:Source>
+  <b:Source>
+    <b:Tag>Uni25</b:Tag>
+    <b:SourceType>InternetSite</b:SourceType>
+    <b:Guid>{A4DAE5BD-9FE7-48C2-9466-593BC67705DB}</b:Guid>
+    <b:Author>
+      <b:Author>
+        <b:Corporate>Universfield</b:Corporate>
+      </b:Author>
+    </b:Author>
+    <b:Title>Pixabay</b:Title>
+    <b:Year>2025</b:Year>
+    <b:YearAccessed>2026</b:YearAccessed>
+    <b:MonthAccessed>Septtember</b:MonthAccessed>
+    <b:DayAccessed>28</b:DayAccessed>
+    <b:URL>https://pixabay.com/sound-effects/film-special-effects-impact-thud-291047/</b:URL>
+    <b:Month>January</b:Month>
+    <b:Day>23</b:Day>
+    <b:RefOrder>2</b:RefOrder>
+  </b:Source>
+</b:Sources>
+</file>
+
 <file path=customXml/itemProps1.xml><?xml version="1.0" encoding="utf-8"?>
 <ds:datastoreItem xmlns:ds="http://schemas.openxmlformats.org/officeDocument/2006/customXml" ds:itemID="{55AF091B-3C7A-41E3-B477-F2FDAA23CFDA}">
   <ds:schemaRefs>
     <ds:schemaRef ds:uri="http://schemas.microsoft.com/office/2006/coverPageProps"/>
   </ds:schemaRefs>
 </ds:datastoreItem>
+</file>
+
+<file path=customXml/itemProps2.xml><?xml version="1.0" encoding="utf-8"?>
+<ds:datastoreItem xmlns:ds="http://schemas.openxmlformats.org/officeDocument/2006/customXml" ds:itemID="{4198955E-7BA7-48A0-B4C1-A0FF5F1CAC4B}">
+  <ds:schemaRefs>
+    <ds:schemaRef ds:uri="http://schemas.openxmlformats.org/officeDocument/2006/bibliography"/>
+  </ds:schemaRefs>
+</ds:datastoreItem>
 </file>
</xml_diff>